<commit_message>
feat(letter): corrected thank-you template, pledge wording, filename and auto-close
- N3: replaced assets/letters/תרומות/מכתב תודה עם סיבה.docx with the corrected
  template. Root cause found in Zoom 24.08 (~2:06-2:35): the reason field in
  the DOCX was defined without RTL, so the quotation marks rendered as if the
  text were English
- M1: a donation against a pledge now reads '<paid> מתוך סך <pledge> נדבת לבכם
  הטוב'. Wording set in Zoom 24.08 - the slash was rejected. Lives in
  donation-utils.formatPledgeAmount, one source of truth
- N1: generated file is named after the donor
- N2: the success screen closes itself instead of asking for confirmation

BizTechoff™ - התאמת העסק לעידן הדיגיטלי
</commit_message>
<xml_diff>
--- a/src/assets/letters/תרומות/מכתב תודה עם סיבה.docx
+++ b/src/assets/letters/תרומות/מכתב תודה עם סיבה.docx
@@ -142,7 +142,7 @@
           <w:szCs w:val="28"/>
           <w:rtl/>
         </w:rPr>
-        <w:t>‏א' חשון תשפ"ו</w:t>
+        <w:t>‏כ"ו אלול תשפ"ו</w:t>
       </w:r>
       <w:r>
         <w:rPr>
@@ -694,11 +694,22 @@
         <w:jc w:val="both"/>
         <w:rPr>
           <w:rFonts w:cs="Livorna"/>
-          <w:b/>
-          <w:bCs/>
-          <w:spacing w:val="4"/>
-          <w:sz w:val="24"/>
-          <w:szCs w:val="24"/>
+          <w:spacing w:val="4"/>
+          <w:sz w:val="28"/>
+          <w:szCs w:val="28"/>
+          <w:rtl/>
+        </w:rPr>
+      </w:pPr>
+    </w:p>
+    <w:p>
+      <w:pPr>
+        <w:bidi/>
+        <w:spacing w:line="440" w:lineRule="exact"/>
+        <w:rPr>
+          <w:rFonts w:cs="Livorna"/>
+          <w:spacing w:val="4"/>
+          <w:sz w:val="28"/>
+          <w:szCs w:val="28"/>
           <w:rtl/>
         </w:rPr>
       </w:pPr>
@@ -939,9 +950,10 @@
       <w:r>
         <w:rPr>
           <w:rFonts w:cs="Livorna" w:hint="cs"/>
-          <w:spacing w:val="4"/>
-          <w:sz w:val="28"/>
-          <w:szCs w:val="28"/>
+          <w:b/>
+          <w:bCs/>
+          <w:sz w:val="32"/>
+          <w:szCs w:val="32"/>
           <w:rtl/>
         </w:rPr>
         <w:t xml:space="preserve"> </w:t>
@@ -951,8 +963,10 @@
           <w:rFonts w:cs="Livorna"/>
           <w:b/>
           <w:bCs/>
-          <w:sz w:val="32"/>
-          <w:szCs w:val="32"/>
+          <w:spacing w:val="4"/>
+          <w:sz w:val="32"/>
+          <w:szCs w:val="32"/>
+          <w:rtl/>
         </w:rPr>
         <w:fldChar w:fldCharType="begin">
           <w:ffData>
@@ -971,27 +985,56 @@
           <w:rFonts w:cs="Livorna"/>
           <w:b/>
           <w:bCs/>
-          <w:sz w:val="32"/>
-          <w:szCs w:val="32"/>
-        </w:rPr>
-        <w:instrText xml:space="preserve"> FORMTEXT </w:instrText>
-      </w:r>
-      <w:r>
-        <w:rPr>
-          <w:rFonts w:cs="Livorna"/>
-          <w:b/>
-          <w:bCs/>
-          <w:sz w:val="32"/>
-          <w:szCs w:val="32"/>
-        </w:rPr>
-      </w:r>
-      <w:r>
-        <w:rPr>
-          <w:rFonts w:cs="Livorna"/>
-          <w:b/>
-          <w:bCs/>
-          <w:sz w:val="32"/>
-          <w:szCs w:val="32"/>
+          <w:spacing w:val="4"/>
+          <w:sz w:val="32"/>
+          <w:szCs w:val="32"/>
+          <w:rtl/>
+        </w:rPr>
+        <w:instrText xml:space="preserve"> </w:instrText>
+      </w:r>
+      <w:r>
+        <w:rPr>
+          <w:rFonts w:cs="Livorna"/>
+          <w:b/>
+          <w:bCs/>
+          <w:spacing w:val="4"/>
+          <w:sz w:val="32"/>
+          <w:szCs w:val="32"/>
+        </w:rPr>
+        <w:instrText>FORMTEXT</w:instrText>
+      </w:r>
+      <w:r>
+        <w:rPr>
+          <w:rFonts w:cs="Livorna"/>
+          <w:b/>
+          <w:bCs/>
+          <w:spacing w:val="4"/>
+          <w:sz w:val="32"/>
+          <w:szCs w:val="32"/>
+          <w:rtl/>
+        </w:rPr>
+        <w:instrText xml:space="preserve"> </w:instrText>
+      </w:r>
+      <w:r>
+        <w:rPr>
+          <w:rFonts w:cs="Livorna"/>
+          <w:b/>
+          <w:bCs/>
+          <w:spacing w:val="4"/>
+          <w:sz w:val="32"/>
+          <w:szCs w:val="32"/>
+          <w:rtl/>
+        </w:rPr>
+      </w:r>
+      <w:r>
+        <w:rPr>
+          <w:rFonts w:cs="Livorna"/>
+          <w:b/>
+          <w:bCs/>
+          <w:spacing w:val="4"/>
+          <w:sz w:val="32"/>
+          <w:szCs w:val="32"/>
+          <w:rtl/>
         </w:rPr>
         <w:fldChar w:fldCharType="separate"/>
       </w:r>
@@ -1000,39 +1043,22 @@
           <w:rFonts w:cs="Livorna"/>
           <w:b/>
           <w:bCs/>
-          <w:sz w:val="32"/>
-          <w:szCs w:val="32"/>
-        </w:rPr>
-        <w:t>{</w:t>
-      </w:r>
-      <w:r>
-        <w:rPr>
-          <w:rFonts w:cs="Livorna"/>
-          <w:b/>
-          <w:bCs/>
-          <w:sz w:val="32"/>
-          <w:szCs w:val="32"/>
-          <w:rtl/>
-        </w:rPr>
-        <w:t>סיבה_תרומה</w:t>
-      </w:r>
-      <w:r>
-        <w:rPr>
-          <w:rFonts w:cs="Livorna"/>
-          <w:b/>
-          <w:bCs/>
-          <w:sz w:val="32"/>
-          <w:szCs w:val="32"/>
-        </w:rPr>
-        <w:t>}</w:t>
-      </w:r>
-      <w:r>
-        <w:rPr>
-          <w:rFonts w:cs="Livorna"/>
-          <w:b/>
-          <w:bCs/>
-          <w:sz w:val="32"/>
-          <w:szCs w:val="32"/>
+          <w:spacing w:val="4"/>
+          <w:sz w:val="32"/>
+          <w:szCs w:val="32"/>
+          <w:rtl/>
+        </w:rPr>
+        <w:t>{סיבה_תרומה}</w:t>
+      </w:r>
+      <w:r>
+        <w:rPr>
+          <w:rFonts w:cs="Livorna"/>
+          <w:b/>
+          <w:bCs/>
+          <w:spacing w:val="4"/>
+          <w:sz w:val="32"/>
+          <w:szCs w:val="32"/>
+          <w:rtl/>
         </w:rPr>
         <w:fldChar w:fldCharType="end"/>
       </w:r>

</xml_diff>